<commit_message>
update with I0 check
</commit_message>
<xml_diff>
--- a/Logbook/24_10_27_logbook_solaredge.docx
+++ b/Logbook/24_10_27_logbook_solaredge.docx
@@ -2363,6 +2363,583 @@
         <w:t>Run the model again to calculate June results</w:t>
       </w:r>
     </w:p>
+    <w:p>
+      <w:pPr>
+        <w:pStyle w:val="Heading1"/>
+      </w:pPr>
+      <w:r>
+        <w:lastRenderedPageBreak/>
+        <w:t>25-11-17</w:t>
+      </w:r>
+    </w:p>
+    <w:p>
+      <w:pPr>
+        <w:pStyle w:val="ListParagraph"/>
+        <w:numPr>
+          <w:ilvl w:val="0"/>
+          <w:numId w:val="12"/>
+        </w:numPr>
+      </w:pPr>
+      <w:r>
+        <w:t>Problem to solve:</w:t>
+      </w:r>
+    </w:p>
+    <w:p>
+      <w:pPr>
+        <w:pStyle w:val="ListParagraph"/>
+        <w:numPr>
+          <w:ilvl w:val="0"/>
+          <w:numId w:val="12"/>
+        </w:numPr>
+      </w:pPr>
+      <w:r>
+        <w:t>I0 validation</w:t>
+      </w:r>
+      <w:r>
+        <w:rPr>
+          <w:rStyle w:val="CommentReference"/>
+          <w:i/>
+          <w:noProof/>
+        </w:rPr>
+        <w:drawing>
+          <wp:inline distT="0" distB="0" distL="0" distR="0" wp14:anchorId="77EDCA16" wp14:editId="786E9DB5">
+            <wp:extent cx="5400000" cy="2589918"/>
+            <wp:effectExtent l="0" t="0" r="0" b="1270"/>
+            <wp:docPr id="445390616" name="Picture 1" descr="A dotted line with a red line&#10;&#10;AI-generated content may be incorrect."/>
+            <wp:cNvGraphicFramePr>
+              <a:graphicFrameLocks xmlns:a="http://schemas.openxmlformats.org/drawingml/2006/main" noChangeAspect="1"/>
+            </wp:cNvGraphicFramePr>
+            <a:graphic xmlns:a="http://schemas.openxmlformats.org/drawingml/2006/main">
+              <a:graphicData uri="http://schemas.openxmlformats.org/drawingml/2006/picture">
+                <pic:pic xmlns:pic="http://schemas.openxmlformats.org/drawingml/2006/picture">
+                  <pic:nvPicPr>
+                    <pic:cNvPr id="445390616" name="Picture 1" descr="A dotted line with a red line&#10;&#10;AI-generated content may be incorrect."/>
+                    <pic:cNvPicPr/>
+                  </pic:nvPicPr>
+                  <pic:blipFill>
+                    <a:blip r:embed="rId19"/>
+                    <a:stretch>
+                      <a:fillRect/>
+                    </a:stretch>
+                  </pic:blipFill>
+                  <pic:spPr>
+                    <a:xfrm>
+                      <a:off x="0" y="0"/>
+                      <a:ext cx="5400000" cy="2589918"/>
+                    </a:xfrm>
+                    <a:prstGeom prst="rect">
+                      <a:avLst/>
+                    </a:prstGeom>
+                  </pic:spPr>
+                </pic:pic>
+              </a:graphicData>
+            </a:graphic>
+          </wp:inline>
+        </w:drawing>
+      </w:r>
+    </w:p>
+    <w:p>
+      <w:pPr>
+        <w:pStyle w:val="ListParagraph"/>
+        <w:numPr>
+          <w:ilvl w:val="0"/>
+          <w:numId w:val="12"/>
+        </w:numPr>
+      </w:pPr>
+      <w:r>
+        <w:t>The results shows that I0 is not constant at all</w:t>
+      </w:r>
+    </w:p>
+    <w:p>
+      <w:pPr>
+        <w:pStyle w:val="ListParagraph"/>
+        <w:numPr>
+          <w:ilvl w:val="0"/>
+          <w:numId w:val="12"/>
+        </w:numPr>
+      </w:pPr>
+      <w:r>
+        <w:t>Try log scale</w:t>
+      </w:r>
+    </w:p>
+    <w:p>
+      <w:pPr>
+        <w:pStyle w:val="ListParagraph"/>
+        <w:numPr>
+          <w:ilvl w:val="1"/>
+          <w:numId w:val="12"/>
+        </w:numPr>
+      </w:pPr>
+      <w:r>
+        <w:t>Find the code</w:t>
+      </w:r>
+      <w:r>
+        <w:t xml:space="preserve"> (done)</w:t>
+      </w:r>
+    </w:p>
+    <w:p>
+      <w:pPr>
+        <w:pStyle w:val="ListParagraph"/>
+        <w:numPr>
+          <w:ilvl w:val="1"/>
+          <w:numId w:val="12"/>
+        </w:numPr>
+      </w:pPr>
+      <w:r>
+        <w:t>Update the scale</w:t>
+      </w:r>
+      <w:r>
+        <w:t xml:space="preserve"> (done)</w:t>
+      </w:r>
+    </w:p>
+    <w:p>
+      <w:pPr>
+        <w:pStyle w:val="ListParagraph"/>
+        <w:numPr>
+          <w:ilvl w:val="1"/>
+          <w:numId w:val="12"/>
+        </w:numPr>
+      </w:pPr>
+      <w:r>
+        <w:t>P</w:t>
+      </w:r>
+      <w:r>
+        <w:t>lot</w:t>
+      </w:r>
+      <w:r>
+        <w:t xml:space="preserve"> (done)</w:t>
+      </w:r>
+    </w:p>
+    <w:p>
+      <w:pPr>
+        <w:pStyle w:val="ListParagraph"/>
+        <w:numPr>
+          <w:ilvl w:val="1"/>
+          <w:numId w:val="12"/>
+        </w:numPr>
+      </w:pPr>
+      <w:r>
+        <w:rPr>
+          <w:noProof/>
+        </w:rPr>
+        <w:drawing>
+          <wp:inline distT="0" distB="0" distL="0" distR="0" wp14:anchorId="23F1CD4E" wp14:editId="2967E518">
+            <wp:extent cx="4385310" cy="1993455"/>
+            <wp:effectExtent l="0" t="0" r="0" b="6985"/>
+            <wp:docPr id="1430380045" name="Picture 1" descr="A group of small black dots&#10;&#10;AI-generated content may be incorrect."/>
+            <wp:cNvGraphicFramePr>
+              <a:graphicFrameLocks xmlns:a="http://schemas.openxmlformats.org/drawingml/2006/main" noChangeAspect="1"/>
+            </wp:cNvGraphicFramePr>
+            <a:graphic xmlns:a="http://schemas.openxmlformats.org/drawingml/2006/main">
+              <a:graphicData uri="http://schemas.openxmlformats.org/drawingml/2006/picture">
+                <pic:pic xmlns:pic="http://schemas.openxmlformats.org/drawingml/2006/picture">
+                  <pic:nvPicPr>
+                    <pic:cNvPr id="1430380045" name="Picture 1" descr="A group of small black dots&#10;&#10;AI-generated content may be incorrect."/>
+                    <pic:cNvPicPr/>
+                  </pic:nvPicPr>
+                  <pic:blipFill>
+                    <a:blip r:embed="rId20"/>
+                    <a:stretch>
+                      <a:fillRect/>
+                    </a:stretch>
+                  </pic:blipFill>
+                  <pic:spPr>
+                    <a:xfrm>
+                      <a:off x="0" y="0"/>
+                      <a:ext cx="4391578" cy="1996304"/>
+                    </a:xfrm>
+                    <a:prstGeom prst="rect">
+                      <a:avLst/>
+                    </a:prstGeom>
+                  </pic:spPr>
+                </pic:pic>
+              </a:graphicData>
+            </a:graphic>
+          </wp:inline>
+        </w:drawing>
+      </w:r>
+    </w:p>
+    <w:p>
+      <w:pPr>
+        <w:pStyle w:val="ListParagraph"/>
+        <w:numPr>
+          <w:ilvl w:val="1"/>
+          <w:numId w:val="12"/>
+        </w:numPr>
+      </w:pPr>
+      <w:r>
+        <w:t>Filter out when I0 is smaller than 1e-11</w:t>
+      </w:r>
+    </w:p>
+    <w:p>
+      <w:pPr>
+        <w:pStyle w:val="ListParagraph"/>
+        <w:numPr>
+          <w:ilvl w:val="1"/>
+          <w:numId w:val="12"/>
+        </w:numPr>
+      </w:pPr>
+      <w:r>
+        <w:drawing>
+          <wp:inline distT="0" distB="0" distL="0" distR="0" wp14:anchorId="208B8400" wp14:editId="036620F8">
+            <wp:extent cx="3896360" cy="1749606"/>
+            <wp:effectExtent l="0" t="0" r="8890" b="3175"/>
+            <wp:docPr id="808962720" name="Picture 1" descr="A line of dots on a white background&#10;&#10;AI-generated content may be incorrect."/>
+            <wp:cNvGraphicFramePr>
+              <a:graphicFrameLocks xmlns:a="http://schemas.openxmlformats.org/drawingml/2006/main" noChangeAspect="1"/>
+            </wp:cNvGraphicFramePr>
+            <a:graphic xmlns:a="http://schemas.openxmlformats.org/drawingml/2006/main">
+              <a:graphicData uri="http://schemas.openxmlformats.org/drawingml/2006/picture">
+                <pic:pic xmlns:pic="http://schemas.openxmlformats.org/drawingml/2006/picture">
+                  <pic:nvPicPr>
+                    <pic:cNvPr id="808962720" name="Picture 1" descr="A line of dots on a white background&#10;&#10;AI-generated content may be incorrect."/>
+                    <pic:cNvPicPr/>
+                  </pic:nvPicPr>
+                  <pic:blipFill>
+                    <a:blip r:embed="rId21"/>
+                    <a:stretch>
+                      <a:fillRect/>
+                    </a:stretch>
+                  </pic:blipFill>
+                  <pic:spPr>
+                    <a:xfrm>
+                      <a:off x="0" y="0"/>
+                      <a:ext cx="3902724" cy="1752464"/>
+                    </a:xfrm>
+                    <a:prstGeom prst="rect">
+                      <a:avLst/>
+                    </a:prstGeom>
+                  </pic:spPr>
+                </pic:pic>
+              </a:graphicData>
+            </a:graphic>
+          </wp:inline>
+        </w:drawing>
+      </w:r>
+    </w:p>
+    <w:p>
+      <w:pPr>
+        <w:pStyle w:val="ListParagraph"/>
+        <w:numPr>
+          <w:ilvl w:val="1"/>
+          <w:numId w:val="12"/>
+        </w:numPr>
+      </w:pPr>
+      <w:r>
+        <w:t>Looks better</w:t>
+      </w:r>
+    </w:p>
+    <w:p>
+      <w:pPr>
+        <w:pStyle w:val="ListParagraph"/>
+        <w:numPr>
+          <w:ilvl w:val="1"/>
+          <w:numId w:val="12"/>
+        </w:numPr>
+      </w:pPr>
+      <w:r>
+        <w:lastRenderedPageBreak/>
+        <w:t xml:space="preserve">Update the session accordingly and </w:t>
+      </w:r>
+      <w:r>
+        <w:t>move to the appendix</w:t>
+      </w:r>
+    </w:p>
+    <w:p>
+      <w:pPr>
+        <w:pStyle w:val="ListParagraph"/>
+        <w:numPr>
+          <w:ilvl w:val="1"/>
+          <w:numId w:val="12"/>
+        </w:numPr>
+      </w:pPr>
+      <w:r>
+        <w:t xml:space="preserve">Idea: what about </w:t>
+      </w:r>
+      <w:r>
+        <w:t>filtering based on the bypass diode activation?</w:t>
+      </w:r>
+      <w:r>
+        <w:t xml:space="preserve"> Failed</w:t>
+      </w:r>
+    </w:p>
+    <w:p>
+      <w:pPr>
+        <w:pStyle w:val="ListParagraph"/>
+        <w:numPr>
+          <w:ilvl w:val="1"/>
+          <w:numId w:val="12"/>
+        </w:numPr>
+      </w:pPr>
+      <w:r>
+        <w:t>The best looking are when I0 is above 1e-11</w:t>
+      </w:r>
+    </w:p>
+    <w:p>
+      <w:pPr>
+        <w:pStyle w:val="ListParagraph"/>
+        <w:numPr>
+          <w:ilvl w:val="1"/>
+          <w:numId w:val="12"/>
+        </w:numPr>
+      </w:pPr>
+      <w:r>
+        <w:t>Need to find a good reason</w:t>
+      </w:r>
+    </w:p>
+    <w:p>
+      <w:pPr>
+        <w:pStyle w:val="ListParagraph"/>
+        <w:numPr>
+          <w:ilvl w:val="0"/>
+          <w:numId w:val="12"/>
+        </w:numPr>
+      </w:pPr>
+      <w:r>
+        <w:t>Try to colour it by different parameters</w:t>
+      </w:r>
+    </w:p>
+    <w:p>
+      <w:pPr>
+        <w:pStyle w:val="ListParagraph"/>
+        <w:numPr>
+          <w:ilvl w:val="0"/>
+          <w:numId w:val="12"/>
+        </w:numPr>
+      </w:pPr>
+      <w:r>
+        <w:t xml:space="preserve">See what they are </w:t>
+      </w:r>
+      <w:r>
+        <w:t>dominate</w:t>
+      </w:r>
+    </w:p>
+    <w:p>
+      <w:pPr>
+        <w:pStyle w:val="ListParagraph"/>
+        <w:numPr>
+          <w:ilvl w:val="0"/>
+          <w:numId w:val="12"/>
+        </w:numPr>
+      </w:pPr>
+      <w:r>
+        <w:t>Seems Imp is the dominate factor</w:t>
+      </w:r>
+    </w:p>
+    <w:p>
+      <w:pPr>
+        <w:pStyle w:val="ListParagraph"/>
+        <w:numPr>
+          <w:ilvl w:val="0"/>
+          <w:numId w:val="12"/>
+        </w:numPr>
+      </w:pPr>
+      <w:r>
+        <w:t>Try to filter out Imp smaller than 2</w:t>
+      </w:r>
+    </w:p>
+    <w:p>
+      <w:pPr>
+        <w:pStyle w:val="ListParagraph"/>
+        <w:numPr>
+          <w:ilvl w:val="0"/>
+          <w:numId w:val="12"/>
+        </w:numPr>
+      </w:pPr>
+      <w:r>
+        <w:drawing>
+          <wp:inline distT="0" distB="0" distL="0" distR="0" wp14:anchorId="553608FE" wp14:editId="0202D87C">
+            <wp:extent cx="5731510" cy="2802890"/>
+            <wp:effectExtent l="0" t="0" r="2540" b="0"/>
+            <wp:docPr id="2046526447" name="Picture 1" descr="A screen shot of a graph&#10;&#10;AI-generated content may be incorrect."/>
+            <wp:cNvGraphicFramePr>
+              <a:graphicFrameLocks xmlns:a="http://schemas.openxmlformats.org/drawingml/2006/main" noChangeAspect="1"/>
+            </wp:cNvGraphicFramePr>
+            <a:graphic xmlns:a="http://schemas.openxmlformats.org/drawingml/2006/main">
+              <a:graphicData uri="http://schemas.openxmlformats.org/drawingml/2006/picture">
+                <pic:pic xmlns:pic="http://schemas.openxmlformats.org/drawingml/2006/picture">
+                  <pic:nvPicPr>
+                    <pic:cNvPr id="2046526447" name="Picture 1" descr="A screen shot of a graph&#10;&#10;AI-generated content may be incorrect."/>
+                    <pic:cNvPicPr/>
+                  </pic:nvPicPr>
+                  <pic:blipFill>
+                    <a:blip r:embed="rId22"/>
+                    <a:stretch>
+                      <a:fillRect/>
+                    </a:stretch>
+                  </pic:blipFill>
+                  <pic:spPr>
+                    <a:xfrm>
+                      <a:off x="0" y="0"/>
+                      <a:ext cx="5731510" cy="2802890"/>
+                    </a:xfrm>
+                    <a:prstGeom prst="rect">
+                      <a:avLst/>
+                    </a:prstGeom>
+                  </pic:spPr>
+                </pic:pic>
+              </a:graphicData>
+            </a:graphic>
+          </wp:inline>
+        </w:drawing>
+      </w:r>
+    </w:p>
+    <w:p>
+      <w:pPr>
+        <w:pStyle w:val="ListParagraph"/>
+        <w:numPr>
+          <w:ilvl w:val="0"/>
+          <w:numId w:val="12"/>
+        </w:numPr>
+      </w:pPr>
+      <w:r>
+        <w:t>OK, hard to filter out anything else</w:t>
+      </w:r>
+    </w:p>
+    <w:p>
+      <w:pPr>
+        <w:pStyle w:val="ListParagraph"/>
+        <w:numPr>
+          <w:ilvl w:val="0"/>
+          <w:numId w:val="12"/>
+        </w:numPr>
+      </w:pPr>
+      <w:r>
+        <w:t xml:space="preserve">I can filter out the case above 2 A just to </w:t>
+      </w:r>
+      <w:r>
+        <w:t xml:space="preserve">say that these are the </w:t>
+      </w:r>
+    </w:p>
+    <w:p>
+      <w:pPr>
+        <w:pStyle w:val="ListParagraph"/>
+        <w:numPr>
+          <w:ilvl w:val="0"/>
+          <w:numId w:val="12"/>
+        </w:numPr>
+      </w:pPr>
+      <w:r>
+        <w:t>The filter</w:t>
+      </w:r>
+    </w:p>
+    <w:p>
+      <w:pPr>
+        <w:pStyle w:val="ListParagraph"/>
+        <w:numPr>
+          <w:ilvl w:val="1"/>
+          <w:numId w:val="12"/>
+        </w:numPr>
+      </w:pPr>
+      <w:r>
+        <w:t>Filter out the case with bypass diode activation</w:t>
+      </w:r>
+    </w:p>
+    <w:p>
+      <w:pPr>
+        <w:pStyle w:val="ListParagraph"/>
+        <w:numPr>
+          <w:ilvl w:val="1"/>
+          <w:numId w:val="12"/>
+        </w:numPr>
+      </w:pPr>
+      <w:r>
+        <w:t xml:space="preserve">Current: &gt; 2A to </w:t>
+      </w:r>
+      <w:r>
+        <w:t>make sensible reading</w:t>
+      </w:r>
+    </w:p>
+    <w:p>
+      <w:pPr>
+        <w:pStyle w:val="ListParagraph"/>
+        <w:numPr>
+          <w:ilvl w:val="0"/>
+          <w:numId w:val="12"/>
+        </w:numPr>
+      </w:pPr>
+      <w:r>
+        <w:t>The idea:</w:t>
+      </w:r>
+      <w:r>
+        <w:t xml:space="preserve"> move it to </w:t>
+      </w:r>
+      <w:r>
+        <w:t>the PPT instead of journal</w:t>
+      </w:r>
+    </w:p>
+    <w:p>
+      <w:pPr>
+        <w:pStyle w:val="ListParagraph"/>
+        <w:numPr>
+          <w:ilvl w:val="0"/>
+          <w:numId w:val="12"/>
+        </w:numPr>
+      </w:pPr>
+      <w:r>
+        <w:t>Show ziv what I have, ask about what to do</w:t>
+      </w:r>
+    </w:p>
+    <w:p>
+      <w:pPr>
+        <w:pStyle w:val="ListParagraph"/>
+        <w:numPr>
+          <w:ilvl w:val="0"/>
+          <w:numId w:val="12"/>
+        </w:numPr>
+      </w:pPr>
+      <w:r>
+        <w:t>SE update</w:t>
+      </w:r>
+    </w:p>
+    <w:p>
+      <w:pPr>
+        <w:pStyle w:val="ListParagraph"/>
+        <w:numPr>
+          <w:ilvl w:val="1"/>
+          <w:numId w:val="12"/>
+        </w:numPr>
+      </w:pPr>
+      <w:r>
+        <w:t>New results</w:t>
+      </w:r>
+    </w:p>
+    <w:p>
+      <w:pPr>
+        <w:pStyle w:val="ListParagraph"/>
+        <w:numPr>
+          <w:ilvl w:val="1"/>
+          <w:numId w:val="12"/>
+        </w:numPr>
+      </w:pPr>
+      <w:r>
+        <w:t>Module number per orientation vs mismatch losses</w:t>
+      </w:r>
+    </w:p>
+    <w:p>
+      <w:pPr>
+        <w:pStyle w:val="ListParagraph"/>
+        <w:numPr>
+          <w:ilvl w:val="1"/>
+          <w:numId w:val="12"/>
+        </w:numPr>
+      </w:pPr>
+      <w:r>
+        <w:t xml:space="preserve">The </w:t>
+      </w:r>
+      <w:r>
+        <w:t>I0/ni^2 show the results and ask Ziv the next step</w:t>
+      </w:r>
+    </w:p>
+    <w:p>
+      <w:pPr>
+        <w:pStyle w:val="ListParagraph"/>
+        <w:numPr>
+          <w:ilvl w:val="1"/>
+          <w:numId w:val="12"/>
+        </w:numPr>
+      </w:pPr>
+    </w:p>
     <w:sectPr>
       <w:pgSz w:w="11906" w:h="16838"/>
       <w:pgMar w:top="1440" w:right="1440" w:bottom="1440" w:left="1440" w:header="708" w:footer="708" w:gutter="0"/>
@@ -2941,6 +3518,119 @@
     </w:lvl>
   </w:abstractNum>
   <w:abstractNum w:abstractNumId="5" w15:restartNumberingAfterBreak="0">
+    <w:nsid w:val="2ECB67E6"/>
+    <w:multiLevelType w:val="hybridMultilevel"/>
+    <w:tmpl w:val="82B84A74"/>
+    <w:lvl w:ilvl="0" w:tplc="0C090001">
+      <w:start w:val="1"/>
+      <w:numFmt w:val="bullet"/>
+      <w:lvlText w:val=""/>
+      <w:lvlJc w:val="left"/>
+      <w:pPr>
+        <w:ind w:left="720" w:hanging="360"/>
+      </w:pPr>
+      <w:rPr>
+        <w:rFonts w:ascii="Symbol" w:hAnsi="Symbol" w:hint="default"/>
+      </w:rPr>
+    </w:lvl>
+    <w:lvl w:ilvl="1" w:tplc="0C090003">
+      <w:start w:val="1"/>
+      <w:numFmt w:val="bullet"/>
+      <w:lvlText w:val="o"/>
+      <w:lvlJc w:val="left"/>
+      <w:pPr>
+        <w:ind w:left="1440" w:hanging="360"/>
+      </w:pPr>
+      <w:rPr>
+        <w:rFonts w:ascii="Courier New" w:hAnsi="Courier New" w:cs="Courier New" w:hint="default"/>
+      </w:rPr>
+    </w:lvl>
+    <w:lvl w:ilvl="2" w:tplc="0C090005" w:tentative="1">
+      <w:start w:val="1"/>
+      <w:numFmt w:val="bullet"/>
+      <w:lvlText w:val=""/>
+      <w:lvlJc w:val="left"/>
+      <w:pPr>
+        <w:ind w:left="2160" w:hanging="360"/>
+      </w:pPr>
+      <w:rPr>
+        <w:rFonts w:ascii="Wingdings" w:hAnsi="Wingdings" w:hint="default"/>
+      </w:rPr>
+    </w:lvl>
+    <w:lvl w:ilvl="3" w:tplc="0C090001" w:tentative="1">
+      <w:start w:val="1"/>
+      <w:numFmt w:val="bullet"/>
+      <w:lvlText w:val=""/>
+      <w:lvlJc w:val="left"/>
+      <w:pPr>
+        <w:ind w:left="2880" w:hanging="360"/>
+      </w:pPr>
+      <w:rPr>
+        <w:rFonts w:ascii="Symbol" w:hAnsi="Symbol" w:hint="default"/>
+      </w:rPr>
+    </w:lvl>
+    <w:lvl w:ilvl="4" w:tplc="0C090003" w:tentative="1">
+      <w:start w:val="1"/>
+      <w:numFmt w:val="bullet"/>
+      <w:lvlText w:val="o"/>
+      <w:lvlJc w:val="left"/>
+      <w:pPr>
+        <w:ind w:left="3600" w:hanging="360"/>
+      </w:pPr>
+      <w:rPr>
+        <w:rFonts w:ascii="Courier New" w:hAnsi="Courier New" w:cs="Courier New" w:hint="default"/>
+      </w:rPr>
+    </w:lvl>
+    <w:lvl w:ilvl="5" w:tplc="0C090005" w:tentative="1">
+      <w:start w:val="1"/>
+      <w:numFmt w:val="bullet"/>
+      <w:lvlText w:val=""/>
+      <w:lvlJc w:val="left"/>
+      <w:pPr>
+        <w:ind w:left="4320" w:hanging="360"/>
+      </w:pPr>
+      <w:rPr>
+        <w:rFonts w:ascii="Wingdings" w:hAnsi="Wingdings" w:hint="default"/>
+      </w:rPr>
+    </w:lvl>
+    <w:lvl w:ilvl="6" w:tplc="0C090001" w:tentative="1">
+      <w:start w:val="1"/>
+      <w:numFmt w:val="bullet"/>
+      <w:lvlText w:val=""/>
+      <w:lvlJc w:val="left"/>
+      <w:pPr>
+        <w:ind w:left="5040" w:hanging="360"/>
+      </w:pPr>
+      <w:rPr>
+        <w:rFonts w:ascii="Symbol" w:hAnsi="Symbol" w:hint="default"/>
+      </w:rPr>
+    </w:lvl>
+    <w:lvl w:ilvl="7" w:tplc="0C090003" w:tentative="1">
+      <w:start w:val="1"/>
+      <w:numFmt w:val="bullet"/>
+      <w:lvlText w:val="o"/>
+      <w:lvlJc w:val="left"/>
+      <w:pPr>
+        <w:ind w:left="5760" w:hanging="360"/>
+      </w:pPr>
+      <w:rPr>
+        <w:rFonts w:ascii="Courier New" w:hAnsi="Courier New" w:cs="Courier New" w:hint="default"/>
+      </w:rPr>
+    </w:lvl>
+    <w:lvl w:ilvl="8" w:tplc="0C090005" w:tentative="1">
+      <w:start w:val="1"/>
+      <w:numFmt w:val="bullet"/>
+      <w:lvlText w:val=""/>
+      <w:lvlJc w:val="left"/>
+      <w:pPr>
+        <w:ind w:left="6480" w:hanging="360"/>
+      </w:pPr>
+      <w:rPr>
+        <w:rFonts w:ascii="Wingdings" w:hAnsi="Wingdings" w:hint="default"/>
+      </w:rPr>
+    </w:lvl>
+  </w:abstractNum>
+  <w:abstractNum w:abstractNumId="6" w15:restartNumberingAfterBreak="0">
     <w:nsid w:val="3D54063B"/>
     <w:multiLevelType w:val="hybridMultilevel"/>
     <w:tmpl w:val="7B26D0B2"/>
@@ -3053,7 +3743,7 @@
       </w:rPr>
     </w:lvl>
   </w:abstractNum>
-  <w:abstractNum w:abstractNumId="6" w15:restartNumberingAfterBreak="0">
+  <w:abstractNum w:abstractNumId="7" w15:restartNumberingAfterBreak="0">
     <w:nsid w:val="54272DB0"/>
     <w:multiLevelType w:val="hybridMultilevel"/>
     <w:tmpl w:val="00202FD8"/>
@@ -3166,7 +3856,7 @@
       </w:rPr>
     </w:lvl>
   </w:abstractNum>
-  <w:abstractNum w:abstractNumId="7" w15:restartNumberingAfterBreak="0">
+  <w:abstractNum w:abstractNumId="8" w15:restartNumberingAfterBreak="0">
     <w:nsid w:val="79324738"/>
     <w:multiLevelType w:val="hybridMultilevel"/>
     <w:tmpl w:val="EDC06E02"/>
@@ -3279,7 +3969,7 @@
       </w:rPr>
     </w:lvl>
   </w:abstractNum>
-  <w:abstractNum w:abstractNumId="8" w15:restartNumberingAfterBreak="0">
+  <w:abstractNum w:abstractNumId="9" w15:restartNumberingAfterBreak="0">
     <w:nsid w:val="7C867CCB"/>
     <w:multiLevelType w:val="hybridMultilevel"/>
     <w:tmpl w:val="A6220942"/>
@@ -3392,7 +4082,7 @@
       </w:rPr>
     </w:lvl>
   </w:abstractNum>
-  <w:abstractNum w:abstractNumId="9" w15:restartNumberingAfterBreak="0">
+  <w:abstractNum w:abstractNumId="10" w15:restartNumberingAfterBreak="0">
     <w:nsid w:val="7D6C680A"/>
     <w:multiLevelType w:val="hybridMultilevel"/>
     <w:tmpl w:val="4832142A"/>
@@ -3505,7 +4195,7 @@
       </w:rPr>
     </w:lvl>
   </w:abstractNum>
-  <w:abstractNum w:abstractNumId="10" w15:restartNumberingAfterBreak="0">
+  <w:abstractNum w:abstractNumId="11" w15:restartNumberingAfterBreak="0">
     <w:nsid w:val="7FC50ADC"/>
     <w:multiLevelType w:val="hybridMultilevel"/>
     <w:tmpl w:val="92A429A0"/>
@@ -3622,34 +4312,37 @@
     <w:abstractNumId w:val="3"/>
   </w:num>
   <w:num w:numId="2" w16cid:durableId="491215055">
-    <w:abstractNumId w:val="6"/>
+    <w:abstractNumId w:val="7"/>
   </w:num>
   <w:num w:numId="3" w16cid:durableId="1339843940">
-    <w:abstractNumId w:val="7"/>
+    <w:abstractNumId w:val="8"/>
   </w:num>
   <w:num w:numId="4" w16cid:durableId="1947956982">
     <w:abstractNumId w:val="2"/>
   </w:num>
   <w:num w:numId="5" w16cid:durableId="1841583292">
-    <w:abstractNumId w:val="9"/>
+    <w:abstractNumId w:val="10"/>
   </w:num>
   <w:num w:numId="6" w16cid:durableId="1693340824">
     <w:abstractNumId w:val="0"/>
   </w:num>
   <w:num w:numId="7" w16cid:durableId="2066098249">
-    <w:abstractNumId w:val="5"/>
+    <w:abstractNumId w:val="6"/>
   </w:num>
   <w:num w:numId="8" w16cid:durableId="213273057">
-    <w:abstractNumId w:val="8"/>
+    <w:abstractNumId w:val="9"/>
   </w:num>
   <w:num w:numId="9" w16cid:durableId="436950691">
-    <w:abstractNumId w:val="10"/>
+    <w:abstractNumId w:val="11"/>
   </w:num>
   <w:num w:numId="10" w16cid:durableId="2087024000">
     <w:abstractNumId w:val="1"/>
   </w:num>
   <w:num w:numId="11" w16cid:durableId="329677576">
     <w:abstractNumId w:val="4"/>
+  </w:num>
+  <w:num w:numId="12" w16cid:durableId="1737509183">
+    <w:abstractNumId w:val="5"/>
   </w:num>
 </w:numbering>
 </file>
@@ -4586,6 +5279,18 @@
       <w14:ligatures w14:val="none"/>
     </w:rPr>
   </w:style>
+  <w:style w:type="character" w:styleId="CommentReference">
+    <w:name w:val="annotation reference"/>
+    <w:basedOn w:val="DefaultParagraphFont"/>
+    <w:uiPriority w:val="99"/>
+    <w:semiHidden/>
+    <w:unhideWhenUsed/>
+    <w:rsid w:val="002165AE"/>
+    <w:rPr>
+      <w:sz w:val="16"/>
+      <w:szCs w:val="16"/>
+    </w:rPr>
+  </w:style>
 </w:styles>
 </file>
 

</xml_diff>

<commit_message>
update the legend font size in figure 3
</commit_message>
<xml_diff>
--- a/Logbook/24_10_27_logbook_solaredge.docx
+++ b/Logbook/24_10_27_logbook_solaredge.docx
@@ -192,7 +192,21 @@
         <w:rPr>
           <w:lang w:val="en-US"/>
         </w:rPr>
-        <w:t>See if the “merged_data” has timestamp information in ti</w:t>
+        <w:t>See if the “</w:t>
+      </w:r>
+      <w:proofErr w:type="spellStart"/>
+      <w:r>
+        <w:rPr>
+          <w:lang w:val="en-US"/>
+        </w:rPr>
+        <w:t>merged_data</w:t>
+      </w:r>
+      <w:proofErr w:type="spellEnd"/>
+      <w:r>
+        <w:rPr>
+          <w:lang w:val="en-US"/>
+        </w:rPr>
+        <w:t>” has timestamp information in ti</w:t>
       </w:r>
       <w:r>
         <w:rPr>
@@ -392,8 +406,16 @@
         <w:rPr>
           <w:lang w:val="en-US"/>
         </w:rPr>
-        <w:t>Summer good</w:t>
-      </w:r>
+        <w:t xml:space="preserve">Summer </w:t>
+      </w:r>
+      <w:proofErr w:type="gramStart"/>
+      <w:r>
+        <w:rPr>
+          <w:lang w:val="en-US"/>
+        </w:rPr>
+        <w:t>good</w:t>
+      </w:r>
+      <w:proofErr w:type="gramEnd"/>
     </w:p>
     <w:p>
       <w:pPr>
@@ -428,8 +450,16 @@
         <w:rPr>
           <w:lang w:val="en-US"/>
         </w:rPr>
-        <w:t>Winter good</w:t>
-      </w:r>
+        <w:t xml:space="preserve">Winter </w:t>
+      </w:r>
+      <w:proofErr w:type="gramStart"/>
+      <w:r>
+        <w:rPr>
+          <w:lang w:val="en-US"/>
+        </w:rPr>
+        <w:t>good</w:t>
+      </w:r>
+      <w:proofErr w:type="gramEnd"/>
     </w:p>
     <w:p>
       <w:pPr>
@@ -482,7 +512,21 @@
         <w:rPr>
           <w:lang w:val="en-US"/>
         </w:rPr>
-        <w:t>The IV data and the MPPT data looks OK</w:t>
+        <w:t xml:space="preserve">The IV data and the MPPT data </w:t>
+      </w:r>
+      <w:proofErr w:type="gramStart"/>
+      <w:r>
+        <w:rPr>
+          <w:lang w:val="en-US"/>
+        </w:rPr>
+        <w:t>looks</w:t>
+      </w:r>
+      <w:proofErr w:type="gramEnd"/>
+      <w:r>
+        <w:rPr>
+          <w:lang w:val="en-US"/>
+        </w:rPr>
+        <w:t xml:space="preserve"> OK</w:t>
       </w:r>
     </w:p>
     <w:p>
@@ -500,8 +544,16 @@
         <w:rPr>
           <w:lang w:val="en-US"/>
         </w:rPr>
-        <w:t>Store a list of data that is taken in the tittle</w:t>
-      </w:r>
+        <w:t xml:space="preserve">Store a list of data that is taken in the </w:t>
+      </w:r>
+      <w:proofErr w:type="gramStart"/>
+      <w:r>
+        <w:rPr>
+          <w:lang w:val="en-US"/>
+        </w:rPr>
+        <w:t>tittle</w:t>
+      </w:r>
+      <w:proofErr w:type="gramEnd"/>
     </w:p>
     <w:p>
       <w:pPr>
@@ -621,11 +673,19 @@
           <w:lang w:val="en-US"/>
         </w:rPr>
       </w:pPr>
-      <w:r>
-        <w:rPr>
-          <w:lang w:val="en-US"/>
-        </w:rPr>
-        <w:t>Still something is wrong</w:t>
+      <w:proofErr w:type="gramStart"/>
+      <w:r>
+        <w:rPr>
+          <w:lang w:val="en-US"/>
+        </w:rPr>
+        <w:t>Still</w:t>
+      </w:r>
+      <w:proofErr w:type="gramEnd"/>
+      <w:r>
+        <w:rPr>
+          <w:lang w:val="en-US"/>
+        </w:rPr>
+        <w:t xml:space="preserve"> something is wrong</w:t>
       </w:r>
     </w:p>
     <w:p>
@@ -644,7 +704,21 @@
           <w:lang w:val="en-US"/>
         </w:rPr>
         <w:lastRenderedPageBreak/>
-        <w:t>Find one day and do by hand</w:t>
+        <w:t xml:space="preserve">Find one day and </w:t>
+      </w:r>
+      <w:proofErr w:type="gramStart"/>
+      <w:r>
+        <w:rPr>
+          <w:lang w:val="en-US"/>
+        </w:rPr>
+        <w:t>do</w:t>
+      </w:r>
+      <w:proofErr w:type="gramEnd"/>
+      <w:r>
+        <w:rPr>
+          <w:lang w:val="en-US"/>
+        </w:rPr>
+        <w:t xml:space="preserve"> by hand</w:t>
       </w:r>
     </w:p>
     <w:p>
@@ -1184,8 +1258,13 @@
         </w:numPr>
       </w:pPr>
       <w:r>
-        <w:t>Run to check if the results still exists</w:t>
-      </w:r>
+        <w:t xml:space="preserve">Run to check if the results still </w:t>
+      </w:r>
+      <w:proofErr w:type="gramStart"/>
+      <w:r>
+        <w:t>exists</w:t>
+      </w:r>
+      <w:proofErr w:type="gramEnd"/>
     </w:p>
     <w:p>
       <w:pPr>
@@ -1296,8 +1375,15 @@
           <w:numId w:val="4"/>
         </w:numPr>
       </w:pPr>
-      <w:r>
-        <w:t>Yes,it works</w:t>
+      <w:proofErr w:type="spellStart"/>
+      <w:proofErr w:type="gramStart"/>
+      <w:r>
+        <w:t>Yes,it</w:t>
+      </w:r>
+      <w:proofErr w:type="spellEnd"/>
+      <w:proofErr w:type="gramEnd"/>
+      <w:r>
+        <w:t xml:space="preserve"> works</w:t>
       </w:r>
     </w:p>
     <w:p>
@@ -1410,7 +1496,15 @@
         </w:numPr>
       </w:pPr>
       <w:r>
-        <w:t>Check if the folder exist and is matching</w:t>
+        <w:t xml:space="preserve">Check if the folder </w:t>
+      </w:r>
+      <w:proofErr w:type="gramStart"/>
+      <w:r>
+        <w:t>exist</w:t>
+      </w:r>
+      <w:proofErr w:type="gramEnd"/>
+      <w:r>
+        <w:t xml:space="preserve"> and is matching</w:t>
       </w:r>
     </w:p>
     <w:p>
@@ -1458,8 +1552,13 @@
         </w:numPr>
       </w:pPr>
       <w:r>
-        <w:t>Review data extraction filter and visualisatoin</w:t>
-      </w:r>
+        <w:t xml:space="preserve">Review data extraction filter and </w:t>
+      </w:r>
+      <w:proofErr w:type="spellStart"/>
+      <w:r>
+        <w:t>visualisatoin</w:t>
+      </w:r>
+      <w:proofErr w:type="spellEnd"/>
     </w:p>
     <w:p>
       <w:pPr>
@@ -1545,8 +1644,13 @@
         </w:numPr>
       </w:pPr>
       <w:r>
-        <w:t>Reopen and save on github</w:t>
-      </w:r>
+        <w:t xml:space="preserve">Reopen and save on </w:t>
+      </w:r>
+      <w:proofErr w:type="spellStart"/>
+      <w:r>
+        <w:t>github</w:t>
+      </w:r>
+      <w:proofErr w:type="spellEnd"/>
     </w:p>
     <w:p>
       <w:pPr>
@@ -1557,7 +1661,15 @@
         </w:numPr>
       </w:pPr>
       <w:r>
-        <w:t>The project it is not on githuhb, clone it first</w:t>
+        <w:t xml:space="preserve">The project it is not on </w:t>
+      </w:r>
+      <w:proofErr w:type="spellStart"/>
+      <w:r>
+        <w:t>githuhb</w:t>
+      </w:r>
+      <w:proofErr w:type="spellEnd"/>
+      <w:r>
+        <w:t>, clone it first</w:t>
       </w:r>
       <w:r>
         <w:t xml:space="preserve"> (done)</w:t>
@@ -1649,7 +1761,15 @@
         </w:numPr>
       </w:pPr>
       <w:r>
-        <w:t>Check if the summer is the same as the witner through the exported data</w:t>
+        <w:t xml:space="preserve">Check if the summer is the same as the </w:t>
+      </w:r>
+      <w:proofErr w:type="spellStart"/>
+      <w:r>
+        <w:t>witner</w:t>
+      </w:r>
+      <w:proofErr w:type="spellEnd"/>
+      <w:r>
+        <w:t xml:space="preserve"> through the exported data</w:t>
       </w:r>
     </w:p>
     <w:p>
@@ -1773,7 +1893,15 @@
         </w:numPr>
       </w:pPr>
       <w:r>
-        <w:t>Just the lable is different</w:t>
+        <w:t xml:space="preserve">Just the </w:t>
+      </w:r>
+      <w:proofErr w:type="spellStart"/>
+      <w:r>
+        <w:t>lable</w:t>
+      </w:r>
+      <w:proofErr w:type="spellEnd"/>
+      <w:r>
+        <w:t xml:space="preserve"> is different</w:t>
       </w:r>
     </w:p>
     <w:p>
@@ -1938,8 +2066,13 @@
         </w:numPr>
       </w:pPr>
       <w:r>
-        <w:t>Four season</w:t>
-      </w:r>
+        <w:t xml:space="preserve">Four </w:t>
+      </w:r>
+      <w:proofErr w:type="gramStart"/>
+      <w:r>
+        <w:t>season</w:t>
+      </w:r>
+      <w:proofErr w:type="gramEnd"/>
     </w:p>
     <w:p>
       <w:pPr>
@@ -2023,8 +2156,13 @@
         </w:numPr>
       </w:pPr>
       <w:r>
-        <w:t>Four season</w:t>
-      </w:r>
+        <w:t xml:space="preserve">Four </w:t>
+      </w:r>
+      <w:proofErr w:type="gramStart"/>
+      <w:r>
+        <w:t>season</w:t>
+      </w:r>
+      <w:proofErr w:type="gramEnd"/>
     </w:p>
     <w:p>
       <w:pPr>
@@ -2580,6 +2718,9 @@
         </w:numPr>
       </w:pPr>
       <w:r>
+        <w:rPr>
+          <w:noProof/>
+        </w:rPr>
         <w:drawing>
           <wp:inline distT="0" distB="0" distL="0" distR="0" wp14:anchorId="208B8400" wp14:editId="036620F8">
             <wp:extent cx="3896360" cy="1749606"/>
@@ -2672,7 +2813,15 @@
         </w:numPr>
       </w:pPr>
       <w:r>
-        <w:t>The best looking are when I0 is above 1e-11</w:t>
+        <w:t xml:space="preserve">The best looking </w:t>
+      </w:r>
+      <w:proofErr w:type="gramStart"/>
+      <w:r>
+        <w:t>are</w:t>
+      </w:r>
+      <w:proofErr w:type="gramEnd"/>
+      <w:r>
+        <w:t xml:space="preserve"> when I0 is above 1e-11</w:t>
       </w:r>
     </w:p>
     <w:p>
@@ -2747,6 +2896,9 @@
         </w:numPr>
       </w:pPr>
       <w:r>
+        <w:rPr>
+          <w:noProof/>
+        </w:rPr>
         <w:drawing>
           <wp:inline distT="0" distB="0" distL="0" distR="0" wp14:anchorId="553608FE" wp14:editId="0202D87C">
             <wp:extent cx="5731510" cy="2802890"/>
@@ -2877,7 +3029,15 @@
         </w:numPr>
       </w:pPr>
       <w:r>
-        <w:t>Show ziv what I have, ask about what to do</w:t>
+        <w:t xml:space="preserve">Show </w:t>
+      </w:r>
+      <w:proofErr w:type="spellStart"/>
+      <w:r>
+        <w:t>ziv</w:t>
+      </w:r>
+      <w:proofErr w:type="spellEnd"/>
+      <w:r>
+        <w:t xml:space="preserve"> what I have, ask about what to do</w:t>
       </w:r>
     </w:p>
     <w:p>

</xml_diff>